<commit_message>
Add risks to Section 5
Added 5 risks that could affect the new system, each with a response.
</commit_message>
<xml_diff>
--- a/report/CA1-rules-uncertainty.docx
+++ b/report/CA1-rules-uncertainty.docx
@@ -20,9 +20,6 @@
     <w:p>
       <w:pPr>
         <w:pStyle w:val="Heading2"/>
-        <w:rPr>
-          <w:lang w:val="ru-RU"/>
-        </w:rPr>
       </w:pPr>
       <w:r>
         <w:t>5.1 Business rules</w:t>
@@ -30,16 +27,12 @@
     </w:p>
     <w:p>
       <w:pPr>
-        <w:pStyle w:val="Heading2"/>
-        <w:rPr>
-          <w:lang w:val="ru-RU"/>
-        </w:rPr>
+        <w:spacing w:after="120"/>
       </w:pPr>
     </w:p>
     <w:tbl>
       <w:tblPr>
         <w:tblW w:w="10000" w:type="dxa"/>
-        <w:tblInd w:w="-5" w:type="dxa"/>
         <w:tblBorders>
           <w:top w:val="single" w:sz="4" w:space="0" w:color="auto"/>
           <w:left w:val="single" w:sz="4" w:space="0" w:color="auto"/>
@@ -120,33 +113,16 @@
           </w:tcPr>
           <w:p>
             <w:pPr>
-              <w:tabs>
-                <w:tab w:val="left" w:pos="1568"/>
-              </w:tabs>
-              <w:spacing w:after="30"/>
-              <w:rPr>
-                <w:color w:val="000000" w:themeColor="text1"/>
-              </w:rPr>
+              <w:spacing w:after="30"/>
             </w:pPr>
             <w:r>
               <w:rPr>
                 <w:b/>
                 <w:bCs/>
-                <w:color w:val="000000" w:themeColor="text1"/>
                 <w:sz w:val="20"/>
                 <w:szCs w:val="20"/>
               </w:rPr>
               <w:t>Business rule</w:t>
-            </w:r>
-            <w:r>
-              <w:rPr>
-                <w:b/>
-                <w:bCs/>
-                <w:color w:val="000000" w:themeColor="text1"/>
-                <w:sz w:val="20"/>
-                <w:szCs w:val="20"/>
-              </w:rPr>
-              <w:tab/>
             </w:r>
           </w:p>
         </w:tc>
@@ -865,6 +841,668 @@
                 <w:szCs w:val="20"/>
               </w:rPr>
               <w:t>E09, E10; equipment officer and safety officer quotes</w:t>
+            </w:r>
+          </w:p>
+        </w:tc>
+      </w:tr>
+    </w:tbl>
+    <w:p>
+      <w:pPr>
+        <w:spacing w:after="80"/>
+      </w:pPr>
+    </w:p>
+    <w:p>
+      <w:pPr>
+        <w:pStyle w:val="Heading2"/>
+      </w:pPr>
+      <w:r>
+        <w:t>5.2 Risks</w:t>
+      </w:r>
+    </w:p>
+    <w:p>
+      <w:pPr>
+        <w:spacing w:after="120"/>
+        <w:rPr>
+          <w:lang w:val="en-US"/>
+        </w:rPr>
+      </w:pPr>
+      <w:r>
+        <w:rPr>
+          <w:i/>
+          <w:iCs/>
+          <w:color w:val="5D6878"/>
+          <w:sz w:val="19"/>
+          <w:szCs w:val="19"/>
+        </w:rPr>
+        <w:t>Based on: Session 3 lecture, “Risks and unanswered questions” (a risk is “an uncertain event or condition that may affect success”, with a response)</w:t>
+      </w:r>
+      <w:r>
+        <w:rPr>
+          <w:i/>
+          <w:iCs/>
+          <w:color w:val="5D6878"/>
+          <w:sz w:val="19"/>
+          <w:szCs w:val="19"/>
+          <w:lang w:val="en-US"/>
+        </w:rPr>
+        <w:t>.</w:t>
+      </w:r>
+    </w:p>
+    <w:tbl>
+      <w:tblPr>
+        <w:tblW w:w="10000" w:type="dxa"/>
+        <w:tblBorders>
+          <w:top w:val="single" w:sz="4" w:space="0" w:color="auto"/>
+          <w:left w:val="single" w:sz="4" w:space="0" w:color="auto"/>
+          <w:bottom w:val="single" w:sz="4" w:space="0" w:color="auto"/>
+          <w:right w:val="single" w:sz="4" w:space="0" w:color="auto"/>
+          <w:insideH w:val="single" w:sz="4" w:space="0" w:color="auto"/>
+          <w:insideV w:val="single" w:sz="4" w:space="0" w:color="auto"/>
+        </w:tblBorders>
+        <w:tblCellMar>
+          <w:left w:w="10" w:type="dxa"/>
+          <w:right w:w="10" w:type="dxa"/>
+        </w:tblCellMar>
+        <w:tblLook w:val="0000" w:firstRow="0" w:lastRow="0" w:firstColumn="0" w:lastColumn="0" w:noHBand="0" w:noVBand="0"/>
+      </w:tblPr>
+      <w:tblGrid>
+        <w:gridCol w:w="900"/>
+        <w:gridCol w:w="5600"/>
+        <w:gridCol w:w="3500"/>
+      </w:tblGrid>
+      <w:tr>
+        <w:tblPrEx>
+          <w:tblCellMar>
+            <w:top w:w="0" w:type="dxa"/>
+            <w:bottom w:w="0" w:type="dxa"/>
+          </w:tblCellMar>
+        </w:tblPrEx>
+        <w:trPr>
+          <w:tblHeader/>
+        </w:trPr>
+        <w:tc>
+          <w:tcPr>
+            <w:tcW w:w="900" w:type="dxa"/>
+            <w:tcBorders>
+              <w:top w:val="single" w:sz="4" w:space="0" w:color="A9B4C2"/>
+              <w:left w:val="single" w:sz="4" w:space="0" w:color="A9B4C2"/>
+              <w:bottom w:val="single" w:sz="4" w:space="0" w:color="A9B4C2"/>
+              <w:right w:val="single" w:sz="4" w:space="0" w:color="A9B4C2"/>
+            </w:tcBorders>
+            <w:shd w:val="clear" w:color="auto" w:fill="DCE6F2"/>
+            <w:tcMar>
+              <w:top w:w="60" w:type="dxa"/>
+              <w:left w:w="100" w:type="dxa"/>
+              <w:bottom w:w="60" w:type="dxa"/>
+              <w:right w:w="100" w:type="dxa"/>
+            </w:tcMar>
+          </w:tcPr>
+          <w:p>
+            <w:pPr>
+              <w:spacing w:after="30"/>
+            </w:pPr>
+            <w:r>
+              <w:rPr>
+                <w:b/>
+                <w:bCs/>
+                <w:sz w:val="20"/>
+                <w:szCs w:val="20"/>
+              </w:rPr>
+              <w:t>ID</w:t>
+            </w:r>
+          </w:p>
+        </w:tc>
+        <w:tc>
+          <w:tcPr>
+            <w:tcW w:w="5600" w:type="dxa"/>
+            <w:tcBorders>
+              <w:top w:val="single" w:sz="4" w:space="0" w:color="A9B4C2"/>
+              <w:left w:val="single" w:sz="4" w:space="0" w:color="A9B4C2"/>
+              <w:bottom w:val="single" w:sz="4" w:space="0" w:color="A9B4C2"/>
+              <w:right w:val="single" w:sz="4" w:space="0" w:color="A9B4C2"/>
+            </w:tcBorders>
+            <w:shd w:val="clear" w:color="auto" w:fill="DCE6F2"/>
+            <w:tcMar>
+              <w:top w:w="60" w:type="dxa"/>
+              <w:left w:w="100" w:type="dxa"/>
+              <w:bottom w:w="60" w:type="dxa"/>
+              <w:right w:w="100" w:type="dxa"/>
+            </w:tcMar>
+          </w:tcPr>
+          <w:p>
+            <w:pPr>
+              <w:spacing w:after="30"/>
+            </w:pPr>
+            <w:r>
+              <w:rPr>
+                <w:b/>
+                <w:bCs/>
+                <w:sz w:val="20"/>
+                <w:szCs w:val="20"/>
+              </w:rPr>
+              <w:t>Risk</w:t>
+            </w:r>
+          </w:p>
+        </w:tc>
+        <w:tc>
+          <w:tcPr>
+            <w:tcW w:w="3500" w:type="dxa"/>
+            <w:tcBorders>
+              <w:top w:val="single" w:sz="4" w:space="0" w:color="A9B4C2"/>
+              <w:left w:val="single" w:sz="4" w:space="0" w:color="A9B4C2"/>
+              <w:bottom w:val="single" w:sz="4" w:space="0" w:color="A9B4C2"/>
+              <w:right w:val="single" w:sz="4" w:space="0" w:color="A9B4C2"/>
+            </w:tcBorders>
+            <w:shd w:val="clear" w:color="auto" w:fill="DCE6F2"/>
+            <w:tcMar>
+              <w:top w:w="60" w:type="dxa"/>
+              <w:left w:w="100" w:type="dxa"/>
+              <w:bottom w:w="60" w:type="dxa"/>
+              <w:right w:w="100" w:type="dxa"/>
+            </w:tcMar>
+          </w:tcPr>
+          <w:p>
+            <w:pPr>
+              <w:spacing w:after="30"/>
+            </w:pPr>
+            <w:r>
+              <w:rPr>
+                <w:b/>
+                <w:bCs/>
+                <w:sz w:val="20"/>
+                <w:szCs w:val="20"/>
+              </w:rPr>
+              <w:t>Response</w:t>
+            </w:r>
+          </w:p>
+        </w:tc>
+      </w:tr>
+      <w:tr>
+        <w:tblPrEx>
+          <w:tblCellMar>
+            <w:top w:w="0" w:type="dxa"/>
+            <w:bottom w:w="0" w:type="dxa"/>
+          </w:tblCellMar>
+        </w:tblPrEx>
+        <w:trPr>
+          <w:cantSplit/>
+        </w:trPr>
+        <w:tc>
+          <w:tcPr>
+            <w:tcW w:w="900" w:type="dxa"/>
+            <w:tcBorders>
+              <w:top w:val="single" w:sz="4" w:space="0" w:color="A9B4C2"/>
+              <w:left w:val="single" w:sz="4" w:space="0" w:color="A9B4C2"/>
+              <w:bottom w:val="single" w:sz="4" w:space="0" w:color="A9B4C2"/>
+              <w:right w:val="single" w:sz="4" w:space="0" w:color="A9B4C2"/>
+            </w:tcBorders>
+            <w:tcMar>
+              <w:top w:w="60" w:type="dxa"/>
+              <w:left w:w="100" w:type="dxa"/>
+              <w:bottom w:w="60" w:type="dxa"/>
+              <w:right w:w="100" w:type="dxa"/>
+            </w:tcMar>
+          </w:tcPr>
+          <w:p>
+            <w:pPr>
+              <w:spacing w:after="30"/>
+            </w:pPr>
+            <w:r>
+              <w:rPr>
+                <w:sz w:val="20"/>
+                <w:szCs w:val="20"/>
+              </w:rPr>
+              <w:t>R01</w:t>
+            </w:r>
+          </w:p>
+        </w:tc>
+        <w:tc>
+          <w:tcPr>
+            <w:tcW w:w="5600" w:type="dxa"/>
+            <w:tcBorders>
+              <w:top w:val="single" w:sz="4" w:space="0" w:color="A9B4C2"/>
+              <w:left w:val="single" w:sz="4" w:space="0" w:color="A9B4C2"/>
+              <w:bottom w:val="single" w:sz="4" w:space="0" w:color="A9B4C2"/>
+              <w:right w:val="single" w:sz="4" w:space="0" w:color="A9B4C2"/>
+            </w:tcBorders>
+            <w:tcMar>
+              <w:top w:w="60" w:type="dxa"/>
+              <w:left w:w="100" w:type="dxa"/>
+              <w:bottom w:w="60" w:type="dxa"/>
+              <w:right w:w="100" w:type="dxa"/>
+            </w:tcMar>
+          </w:tcPr>
+          <w:p>
+            <w:pPr>
+              <w:spacing w:after="30"/>
+            </w:pPr>
+            <w:r>
+              <w:rPr>
+                <w:sz w:val="20"/>
+                <w:szCs w:val="20"/>
+              </w:rPr>
+              <w:t>Old records may be incomplete, wrong or duplicated. If they are moved into the new system, the mistakes move with them.</w:t>
+            </w:r>
+          </w:p>
+        </w:tc>
+        <w:tc>
+          <w:tcPr>
+            <w:tcW w:w="3500" w:type="dxa"/>
+            <w:tcBorders>
+              <w:top w:val="single" w:sz="4" w:space="0" w:color="A9B4C2"/>
+              <w:left w:val="single" w:sz="4" w:space="0" w:color="A9B4C2"/>
+              <w:bottom w:val="single" w:sz="4" w:space="0" w:color="A9B4C2"/>
+              <w:right w:val="single" w:sz="4" w:space="0" w:color="A9B4C2"/>
+            </w:tcBorders>
+            <w:tcMar>
+              <w:top w:w="60" w:type="dxa"/>
+              <w:left w:w="100" w:type="dxa"/>
+              <w:bottom w:w="60" w:type="dxa"/>
+              <w:right w:w="100" w:type="dxa"/>
+            </w:tcMar>
+          </w:tcPr>
+          <w:p>
+            <w:pPr>
+              <w:spacing w:after="30"/>
+            </w:pPr>
+            <w:r>
+              <w:rPr>
+                <w:sz w:val="20"/>
+                <w:szCs w:val="20"/>
+              </w:rPr>
+              <w:t>Check the old logs and messages before moving them.</w:t>
+            </w:r>
+          </w:p>
+        </w:tc>
+      </w:tr>
+      <w:tr>
+        <w:tblPrEx>
+          <w:tblCellMar>
+            <w:top w:w="0" w:type="dxa"/>
+            <w:bottom w:w="0" w:type="dxa"/>
+          </w:tblCellMar>
+        </w:tblPrEx>
+        <w:trPr>
+          <w:cantSplit/>
+        </w:trPr>
+        <w:tc>
+          <w:tcPr>
+            <w:tcW w:w="900" w:type="dxa"/>
+            <w:tcBorders>
+              <w:top w:val="single" w:sz="4" w:space="0" w:color="A9B4C2"/>
+              <w:left w:val="single" w:sz="4" w:space="0" w:color="A9B4C2"/>
+              <w:bottom w:val="single" w:sz="4" w:space="0" w:color="A9B4C2"/>
+              <w:right w:val="single" w:sz="4" w:space="0" w:color="A9B4C2"/>
+            </w:tcBorders>
+            <w:tcMar>
+              <w:top w:w="60" w:type="dxa"/>
+              <w:left w:w="100" w:type="dxa"/>
+              <w:bottom w:w="60" w:type="dxa"/>
+              <w:right w:w="100" w:type="dxa"/>
+            </w:tcMar>
+          </w:tcPr>
+          <w:p>
+            <w:pPr>
+              <w:spacing w:after="30"/>
+            </w:pPr>
+            <w:r>
+              <w:rPr>
+                <w:sz w:val="20"/>
+                <w:szCs w:val="20"/>
+              </w:rPr>
+              <w:t>R02</w:t>
+            </w:r>
+          </w:p>
+        </w:tc>
+        <w:tc>
+          <w:tcPr>
+            <w:tcW w:w="5600" w:type="dxa"/>
+            <w:tcBorders>
+              <w:top w:val="single" w:sz="4" w:space="0" w:color="A9B4C2"/>
+              <w:left w:val="single" w:sz="4" w:space="0" w:color="A9B4C2"/>
+              <w:bottom w:val="single" w:sz="4" w:space="0" w:color="A9B4C2"/>
+              <w:right w:val="single" w:sz="4" w:space="0" w:color="A9B4C2"/>
+            </w:tcBorders>
+            <w:tcMar>
+              <w:top w:w="60" w:type="dxa"/>
+              <w:left w:w="100" w:type="dxa"/>
+              <w:bottom w:w="60" w:type="dxa"/>
+              <w:right w:w="100" w:type="dxa"/>
+            </w:tcMar>
+          </w:tcPr>
+          <w:p>
+            <w:pPr>
+              <w:spacing w:after="30"/>
+            </w:pPr>
+            <w:r>
+              <w:rPr>
+                <w:sz w:val="20"/>
+                <w:szCs w:val="20"/>
+              </w:rPr>
+              <w:t>Staff may keep agreeing changes by radio and forget to enter them, so the system shows out-of-date information again.</w:t>
+            </w:r>
+          </w:p>
+        </w:tc>
+        <w:tc>
+          <w:tcPr>
+            <w:tcW w:w="3500" w:type="dxa"/>
+            <w:tcBorders>
+              <w:top w:val="single" w:sz="4" w:space="0" w:color="A9B4C2"/>
+              <w:left w:val="single" w:sz="4" w:space="0" w:color="A9B4C2"/>
+              <w:bottom w:val="single" w:sz="4" w:space="0" w:color="A9B4C2"/>
+              <w:right w:val="single" w:sz="4" w:space="0" w:color="A9B4C2"/>
+            </w:tcBorders>
+            <w:tcMar>
+              <w:top w:w="60" w:type="dxa"/>
+              <w:left w:w="100" w:type="dxa"/>
+              <w:bottom w:w="60" w:type="dxa"/>
+              <w:right w:w="100" w:type="dxa"/>
+            </w:tcMar>
+          </w:tcPr>
+          <w:p>
+            <w:pPr>
+              <w:spacing w:after="30"/>
+            </w:pPr>
+            <w:r>
+              <w:rPr>
+                <w:sz w:val="20"/>
+                <w:szCs w:val="20"/>
+              </w:rPr>
+              <w:t>Find out who has to enter changes and how quickly (Q14).</w:t>
+            </w:r>
+          </w:p>
+        </w:tc>
+      </w:tr>
+      <w:tr>
+        <w:tblPrEx>
+          <w:tblCellMar>
+            <w:top w:w="0" w:type="dxa"/>
+            <w:bottom w:w="0" w:type="dxa"/>
+          </w:tblCellMar>
+        </w:tblPrEx>
+        <w:trPr>
+          <w:cantSplit/>
+        </w:trPr>
+        <w:tc>
+          <w:tcPr>
+            <w:tcW w:w="900" w:type="dxa"/>
+            <w:tcBorders>
+              <w:top w:val="single" w:sz="4" w:space="0" w:color="A9B4C2"/>
+              <w:left w:val="single" w:sz="4" w:space="0" w:color="A9B4C2"/>
+              <w:bottom w:val="single" w:sz="4" w:space="0" w:color="A9B4C2"/>
+              <w:right w:val="single" w:sz="4" w:space="0" w:color="A9B4C2"/>
+            </w:tcBorders>
+            <w:tcMar>
+              <w:top w:w="60" w:type="dxa"/>
+              <w:left w:w="100" w:type="dxa"/>
+              <w:bottom w:w="60" w:type="dxa"/>
+              <w:right w:w="100" w:type="dxa"/>
+            </w:tcMar>
+          </w:tcPr>
+          <w:p>
+            <w:pPr>
+              <w:spacing w:after="30"/>
+            </w:pPr>
+            <w:r>
+              <w:rPr>
+                <w:sz w:val="20"/>
+                <w:szCs w:val="20"/>
+              </w:rPr>
+              <w:t>R03</w:t>
+            </w:r>
+          </w:p>
+        </w:tc>
+        <w:tc>
+          <w:tcPr>
+            <w:tcW w:w="5600" w:type="dxa"/>
+            <w:tcBorders>
+              <w:top w:val="single" w:sz="4" w:space="0" w:color="A9B4C2"/>
+              <w:left w:val="single" w:sz="4" w:space="0" w:color="A9B4C2"/>
+              <w:bottom w:val="single" w:sz="4" w:space="0" w:color="A9B4C2"/>
+              <w:right w:val="single" w:sz="4" w:space="0" w:color="A9B4C2"/>
+            </w:tcBorders>
+            <w:tcMar>
+              <w:top w:w="60" w:type="dxa"/>
+              <w:left w:w="100" w:type="dxa"/>
+              <w:bottom w:w="60" w:type="dxa"/>
+              <w:right w:w="100" w:type="dxa"/>
+            </w:tcMar>
+          </w:tcPr>
+          <w:p>
+            <w:pPr>
+              <w:spacing w:after="30"/>
+            </w:pPr>
+            <w:r>
+              <w:rPr>
+                <w:sz w:val="20"/>
+                <w:szCs w:val="20"/>
+              </w:rPr>
+              <w:t>Many harbour rules are not agreed yet (e.g. how long to hold a booking, who can refuse an arrival). If the answers take a long time, some requirements cannot be finished.</w:t>
+            </w:r>
+          </w:p>
+        </w:tc>
+        <w:tc>
+          <w:tcPr>
+            <w:tcW w:w="3500" w:type="dxa"/>
+            <w:tcBorders>
+              <w:top w:val="single" w:sz="4" w:space="0" w:color="A9B4C2"/>
+              <w:left w:val="single" w:sz="4" w:space="0" w:color="A9B4C2"/>
+              <w:bottom w:val="single" w:sz="4" w:space="0" w:color="A9B4C2"/>
+              <w:right w:val="single" w:sz="4" w:space="0" w:color="A9B4C2"/>
+            </w:tcBorders>
+            <w:tcMar>
+              <w:top w:w="60" w:type="dxa"/>
+              <w:left w:w="100" w:type="dxa"/>
+              <w:bottom w:w="60" w:type="dxa"/>
+              <w:right w:w="100" w:type="dxa"/>
+            </w:tcMar>
+          </w:tcPr>
+          <w:p>
+            <w:pPr>
+              <w:spacing w:after="30"/>
+            </w:pPr>
+            <w:r>
+              <w:rPr>
+                <w:sz w:val="20"/>
+                <w:szCs w:val="20"/>
+              </w:rPr>
+              <w:t>Ask the coordinator and management the open questions as early as possible.</w:t>
+            </w:r>
+          </w:p>
+        </w:tc>
+      </w:tr>
+      <w:tr>
+        <w:tblPrEx>
+          <w:tblCellMar>
+            <w:top w:w="0" w:type="dxa"/>
+            <w:bottom w:w="0" w:type="dxa"/>
+          </w:tblCellMar>
+        </w:tblPrEx>
+        <w:trPr>
+          <w:cantSplit/>
+        </w:trPr>
+        <w:tc>
+          <w:tcPr>
+            <w:tcW w:w="900" w:type="dxa"/>
+            <w:tcBorders>
+              <w:top w:val="single" w:sz="4" w:space="0" w:color="A9B4C2"/>
+              <w:left w:val="single" w:sz="4" w:space="0" w:color="A9B4C2"/>
+              <w:bottom w:val="single" w:sz="4" w:space="0" w:color="A9B4C2"/>
+              <w:right w:val="single" w:sz="4" w:space="0" w:color="A9B4C2"/>
+            </w:tcBorders>
+            <w:tcMar>
+              <w:top w:w="60" w:type="dxa"/>
+              <w:left w:w="100" w:type="dxa"/>
+              <w:bottom w:w="60" w:type="dxa"/>
+              <w:right w:w="100" w:type="dxa"/>
+            </w:tcMar>
+          </w:tcPr>
+          <w:p>
+            <w:pPr>
+              <w:spacing w:after="30"/>
+            </w:pPr>
+            <w:r>
+              <w:rPr>
+                <w:sz w:val="20"/>
+                <w:szCs w:val="20"/>
+              </w:rPr>
+              <w:t>R04</w:t>
+            </w:r>
+          </w:p>
+        </w:tc>
+        <w:tc>
+          <w:tcPr>
+            <w:tcW w:w="5600" w:type="dxa"/>
+            <w:tcBorders>
+              <w:top w:val="single" w:sz="4" w:space="0" w:color="A9B4C2"/>
+              <w:left w:val="single" w:sz="4" w:space="0" w:color="A9B4C2"/>
+              <w:bottom w:val="single" w:sz="4" w:space="0" w:color="A9B4C2"/>
+              <w:right w:val="single" w:sz="4" w:space="0" w:color="A9B4C2"/>
+            </w:tcBorders>
+            <w:tcMar>
+              <w:top w:w="60" w:type="dxa"/>
+              <w:left w:w="100" w:type="dxa"/>
+              <w:bottom w:w="60" w:type="dxa"/>
+              <w:right w:w="100" w:type="dxa"/>
+            </w:tcMar>
+          </w:tcPr>
+          <w:p>
+            <w:pPr>
+              <w:spacing w:after="30"/>
+            </w:pPr>
+            <w:r>
+              <w:rPr>
+                <w:sz w:val="20"/>
+                <w:szCs w:val="20"/>
+              </w:rPr>
+              <w:t>Staff already disagree about how long to hold a booking. If a rule is chosen that they do not like, they may not want to use the system.</w:t>
+            </w:r>
+          </w:p>
+        </w:tc>
+        <w:tc>
+          <w:tcPr>
+            <w:tcW w:w="3500" w:type="dxa"/>
+            <w:tcBorders>
+              <w:top w:val="single" w:sz="4" w:space="0" w:color="A9B4C2"/>
+              <w:left w:val="single" w:sz="4" w:space="0" w:color="A9B4C2"/>
+              <w:bottom w:val="single" w:sz="4" w:space="0" w:color="A9B4C2"/>
+              <w:right w:val="single" w:sz="4" w:space="0" w:color="A9B4C2"/>
+            </w:tcBorders>
+            <w:tcMar>
+              <w:top w:w="60" w:type="dxa"/>
+              <w:left w:w="100" w:type="dxa"/>
+              <w:bottom w:w="60" w:type="dxa"/>
+              <w:right w:w="100" w:type="dxa"/>
+            </w:tcMar>
+          </w:tcPr>
+          <w:p>
+            <w:pPr>
+              <w:spacing w:after="30"/>
+            </w:pPr>
+            <w:r>
+              <w:rPr>
+                <w:sz w:val="20"/>
+                <w:szCs w:val="20"/>
+              </w:rPr>
+              <w:t>Talk the rules through with staff before they are agreed.</w:t>
+            </w:r>
+          </w:p>
+        </w:tc>
+      </w:tr>
+      <w:tr>
+        <w:tblPrEx>
+          <w:tblCellMar>
+            <w:top w:w="0" w:type="dxa"/>
+            <w:bottom w:w="0" w:type="dxa"/>
+          </w:tblCellMar>
+        </w:tblPrEx>
+        <w:trPr>
+          <w:cantSplit/>
+        </w:trPr>
+        <w:tc>
+          <w:tcPr>
+            <w:tcW w:w="900" w:type="dxa"/>
+            <w:tcBorders>
+              <w:top w:val="single" w:sz="4" w:space="0" w:color="A9B4C2"/>
+              <w:left w:val="single" w:sz="4" w:space="0" w:color="A9B4C2"/>
+              <w:bottom w:val="single" w:sz="4" w:space="0" w:color="A9B4C2"/>
+              <w:right w:val="single" w:sz="4" w:space="0" w:color="A9B4C2"/>
+            </w:tcBorders>
+            <w:tcMar>
+              <w:top w:w="60" w:type="dxa"/>
+              <w:left w:w="100" w:type="dxa"/>
+              <w:bottom w:w="60" w:type="dxa"/>
+              <w:right w:w="100" w:type="dxa"/>
+            </w:tcMar>
+          </w:tcPr>
+          <w:p>
+            <w:pPr>
+              <w:spacing w:after="30"/>
+            </w:pPr>
+            <w:r>
+              <w:rPr>
+                <w:sz w:val="20"/>
+                <w:szCs w:val="20"/>
+              </w:rPr>
+              <w:t>R05</w:t>
+            </w:r>
+          </w:p>
+        </w:tc>
+        <w:tc>
+          <w:tcPr>
+            <w:tcW w:w="5600" w:type="dxa"/>
+            <w:tcBorders>
+              <w:top w:val="single" w:sz="4" w:space="0" w:color="A9B4C2"/>
+              <w:left w:val="single" w:sz="4" w:space="0" w:color="A9B4C2"/>
+              <w:bottom w:val="single" w:sz="4" w:space="0" w:color="A9B4C2"/>
+              <w:right w:val="single" w:sz="4" w:space="0" w:color="A9B4C2"/>
+            </w:tcBorders>
+            <w:tcMar>
+              <w:top w:w="60" w:type="dxa"/>
+              <w:left w:w="100" w:type="dxa"/>
+              <w:bottom w:w="60" w:type="dxa"/>
+              <w:right w:w="100" w:type="dxa"/>
+            </w:tcMar>
+          </w:tcPr>
+          <w:p>
+            <w:pPr>
+              <w:spacing w:after="30"/>
+            </w:pPr>
+            <w:r>
+              <w:rPr>
+                <w:sz w:val="20"/>
+                <w:szCs w:val="20"/>
+              </w:rPr>
+              <w:t>Equipment status may not be updated on time (e.g. it has dried or passed its inspection), so the system shows the wrong readiness.</w:t>
+            </w:r>
+          </w:p>
+        </w:tc>
+        <w:tc>
+          <w:tcPr>
+            <w:tcW w:w="3500" w:type="dxa"/>
+            <w:tcBorders>
+              <w:top w:val="single" w:sz="4" w:space="0" w:color="A9B4C2"/>
+              <w:left w:val="single" w:sz="4" w:space="0" w:color="A9B4C2"/>
+              <w:bottom w:val="single" w:sz="4" w:space="0" w:color="A9B4C2"/>
+              <w:right w:val="single" w:sz="4" w:space="0" w:color="A9B4C2"/>
+            </w:tcBorders>
+            <w:tcMar>
+              <w:top w:w="60" w:type="dxa"/>
+              <w:left w:w="100" w:type="dxa"/>
+              <w:bottom w:w="60" w:type="dxa"/>
+              <w:right w:w="100" w:type="dxa"/>
+            </w:tcMar>
+          </w:tcPr>
+          <w:p>
+            <w:pPr>
+              <w:spacing w:after="30"/>
+            </w:pPr>
+            <w:r>
+              <w:rPr>
+                <w:sz w:val="20"/>
+                <w:szCs w:val="20"/>
+              </w:rPr>
+              <w:t>Find out who is responsible for updating equipment status.</w:t>
             </w:r>
           </w:p>
         </w:tc>
@@ -982,10 +1620,10 @@
 <file path=word/numbering.xml><?xml version="1.0" encoding="utf-8"?>
 <w:numbering xmlns:wpc="http://schemas.microsoft.com/office/word/2010/wordprocessingCanvas" xmlns:cx="http://schemas.microsoft.com/office/drawing/2014/chartex" xmlns:cx1="http://schemas.microsoft.com/office/drawing/2015/9/8/chartex" xmlns:cx2="http://schemas.microsoft.com/office/drawing/2015/10/21/chartex" xmlns:cx3="http://schemas.microsoft.com/office/drawing/2016/5/9/chartex" xmlns:cx4="http://schemas.microsoft.com/office/drawing/2016/5/10/chartex" xmlns:cx5="http://schemas.microsoft.com/office/drawing/2016/5/11/chartex" xmlns:cx6="http://schemas.microsoft.com/office/drawing/2016/5/12/chartex" xmlns:cx7="http://schemas.microsoft.com/office/drawing/2016/5/13/chartex" xmlns:cx8="http://schemas.microsoft.com/office/drawing/2016/5/14/chartex" xmlns:mc="http://schemas.openxmlformats.org/markup-compatibility/2006" xmlns:m="http://schemas.openxmlformats.org/officeDocument/2006/math" xmlns:aink="http://schemas.microsoft.com/office/drawing/2016/ink" xmlns:am3d="http://schemas.microsoft.com/office/drawing/2017/model3d" xmlns:oel="http://schemas.microsoft.com/office/2019/extlst" xmlns:r="http://schemas.openxmlformats.org/officeDocument/2006/relationships" xmlns:wp14="http://schemas.microsoft.com/office/word/2010/wordprocessingDrawing" xmlns:wp="http://schemas.openxmlformats.org/drawingml/2006/wordprocessingDrawing" xmlns:wpg="http://schemas.microsoft.com/office/word/2010/wordprocessingGroup" xmlns:wpi="http://schemas.microsoft.com/office/word/2010/wordprocessingInk" xmlns:wps="http://schemas.microsoft.com/office/word/2010/wordprocessingShape" xmlns:o="urn:schemas-microsoft-com:office:office" xmlns:v="urn:schemas-microsoft-com:vml" xmlns:w10="urn:schemas-microsoft-com:office:word" xmlns:w="http://schemas.openxmlformats.org/wordprocessingml/2006/main" xmlns:w14="http://schemas.microsoft.com/office/word/2010/wordml" xmlns:w15="http://schemas.microsoft.com/office/word/2012/wordml" xmlns:w16cex="http://schemas.microsoft.com/office/word/2018/wordml/cex" xmlns:w16cid="http://schemas.microsoft.com/office/word/2016/wordml/cid" xmlns:w16="http://schemas.microsoft.com/office/word/2018/wordml" xmlns:w16sdtdh="http://schemas.microsoft.com/office/word/2020/wordml/sdtdatahash" xmlns:w16sdtfl="http://schemas.microsoft.com/office/word/2024/wordml/sdtformatlock" xmlns:w16se="http://schemas.microsoft.com/office/word/2015/wordml/symex" xmlns:w16du="http://schemas.microsoft.com/office/word/2023/wordml/word16du" xmlns:wne="http://schemas.microsoft.com/office/word/2006/wordml" mc:Ignorable="w14 w15 w16se w16cid w16 w16cex w16sdtdh w16sdtfl w16du wp14">
   <w:abstractNum w:abstractNumId="0" w15:restartNumberingAfterBreak="0">
-    <w:nsid w:val="42DA5EEE"/>
+    <w:nsid w:val="022609AD"/>
     <w:multiLevelType w:val="hybridMultilevel"/>
-    <w:tmpl w:val="36DC2362"/>
-    <w:lvl w:ilvl="0" w:tplc="B88EA4D4">
+    <w:tmpl w:val="E082792A"/>
+    <w:lvl w:ilvl="0" w:tplc="9D58BF6E">
       <w:start w:val="1"/>
       <w:numFmt w:val="bullet"/>
       <w:lvlText w:val="●"/>
@@ -994,7 +1632,7 @@
         <w:ind w:left="720" w:hanging="360"/>
       </w:pPr>
     </w:lvl>
-    <w:lvl w:ilvl="1" w:tplc="D4DCABB8">
+    <w:lvl w:ilvl="1" w:tplc="8EEA4930">
       <w:start w:val="1"/>
       <w:numFmt w:val="bullet"/>
       <w:lvlText w:val="○"/>
@@ -1003,7 +1641,7 @@
         <w:ind w:left="1440" w:hanging="360"/>
       </w:pPr>
     </w:lvl>
-    <w:lvl w:ilvl="2" w:tplc="2E2490D4">
+    <w:lvl w:ilvl="2" w:tplc="3F96EFAE">
       <w:start w:val="1"/>
       <w:numFmt w:val="bullet"/>
       <w:lvlText w:val="■"/>
@@ -1012,7 +1650,7 @@
         <w:ind w:left="2160" w:hanging="360"/>
       </w:pPr>
     </w:lvl>
-    <w:lvl w:ilvl="3" w:tplc="8D54441A">
+    <w:lvl w:ilvl="3" w:tplc="7938CFF6">
       <w:start w:val="1"/>
       <w:numFmt w:val="bullet"/>
       <w:lvlText w:val="●"/>
@@ -1021,7 +1659,7 @@
         <w:ind w:left="2880" w:hanging="360"/>
       </w:pPr>
     </w:lvl>
-    <w:lvl w:ilvl="4" w:tplc="145A2AEC">
+    <w:lvl w:ilvl="4" w:tplc="AFFCEA3A">
       <w:start w:val="1"/>
       <w:numFmt w:val="bullet"/>
       <w:lvlText w:val="○"/>
@@ -1030,7 +1668,7 @@
         <w:ind w:left="3600" w:hanging="360"/>
       </w:pPr>
     </w:lvl>
-    <w:lvl w:ilvl="5" w:tplc="1702EBB6">
+    <w:lvl w:ilvl="5" w:tplc="3CCA81C8">
       <w:start w:val="1"/>
       <w:numFmt w:val="bullet"/>
       <w:lvlText w:val="■"/>
@@ -1039,7 +1677,7 @@
         <w:ind w:left="4320" w:hanging="360"/>
       </w:pPr>
     </w:lvl>
-    <w:lvl w:ilvl="6" w:tplc="2B966964">
+    <w:lvl w:ilvl="6" w:tplc="39ACFAAE">
       <w:start w:val="1"/>
       <w:numFmt w:val="bullet"/>
       <w:lvlText w:val="●"/>
@@ -1048,7 +1686,7 @@
         <w:ind w:left="5040" w:hanging="360"/>
       </w:pPr>
     </w:lvl>
-    <w:lvl w:ilvl="7" w:tplc="7B68B98E">
+    <w:lvl w:ilvl="7" w:tplc="9B5A40BA">
       <w:start w:val="1"/>
       <w:numFmt w:val="bullet"/>
       <w:lvlText w:val="●"/>
@@ -1057,7 +1695,7 @@
         <w:ind w:left="5760" w:hanging="360"/>
       </w:pPr>
     </w:lvl>
-    <w:lvl w:ilvl="8" w:tplc="F5648DCA">
+    <w:lvl w:ilvl="8" w:tplc="A13AC5AA">
       <w:start w:val="1"/>
       <w:numFmt w:val="bullet"/>
       <w:lvlText w:val="●"/>
@@ -1067,7 +1705,7 @@
       </w:pPr>
     </w:lvl>
   </w:abstractNum>
-  <w:num w:numId="1" w16cid:durableId="1504660426">
+  <w:num w:numId="1" w16cid:durableId="104887263">
     <w:abstractNumId w:val="0"/>
     <w:lvlOverride w:ilvl="0">
       <w:startOverride w:val="1"/>

</xml_diff>